<commit_message>
Update backend document generator services and template resources
</commit_message>
<xml_diff>
--- a/backend sp/demo/src/main/resources/FORM3main.docx
+++ b/backend sp/demo/src/main/resources/FORM3main.docx
@@ -869,8 +869,6 @@
               </w:rPr>
               <w:t xml:space="preserve">  </w:t>
             </w:r>
-            <w:bookmarkStart w:id="0" w:name="_GoBack"/>
-            <w:bookmarkEnd w:id="0"/>
           </w:p>
           <w:p>
             <w:pPr>
@@ -1004,7 +1002,7 @@
                 <w:sz w:val="24"/>
                 <w:lang w:val="en-US"/>
               </w:rPr>
-              <w:t xml:space="preserve"> {date} </w:t>
+              <w:t xml:space="preserve">……………. </w:t>
             </w:r>
             <w:r>
               <w:rPr>
@@ -2599,7 +2597,8 @@
               <w:rPr>
                 <w:rFonts w:ascii="Arial"/>
                 <w:b/>
-                <w:sz w:val="24"/>
+                <w:sz w:val="20"/>
+                <w:szCs w:val="20"/>
               </w:rPr>
             </w:pPr>
             <w:r>
@@ -2608,7 +2607,8 @@
                 <w:b/>
                 <w:spacing w:val="-5"/>
                 <w:w w:val="90"/>
-                <w:sz w:val="24"/>
+                <w:sz w:val="20"/>
+                <w:szCs w:val="20"/>
               </w:rPr>
               <w:t>To</w:t>
             </w:r>
@@ -2618,17 +2618,19 @@
               <w:pStyle w:val="5"/>
               <w:ind w:left="520" w:right="4456"/>
               <w:rPr>
-                <w:rFonts w:ascii="Arial"/>
-                <w:b/>
-                <w:sz w:val="24"/>
-              </w:rPr>
-            </w:pPr>
-            <w:r>
-              <w:rPr>
-                <w:rFonts w:ascii="Arial"/>
-                <w:b/>
-                <w:w w:val="85"/>
-                <w:sz w:val="24"/>
+                <w:rFonts w:hint="default" w:ascii="Arial"/>
+                <w:b/>
+                <w:sz w:val="24"/>
+                <w:lang w:val="en-US"/>
+              </w:rPr>
+            </w:pPr>
+            <w:r>
+              <w:rPr>
+                <w:rFonts w:ascii="Arial"/>
+                <w:b/>
+                <w:w w:val="85"/>
+                <w:sz w:val="20"/>
+                <w:szCs w:val="20"/>
               </w:rPr>
               <w:t xml:space="preserve">The Controller of Patents, </w:t>
             </w:r>
@@ -2637,10 +2639,24 @@
                 <w:rFonts w:ascii="Arial"/>
                 <w:b/>
                 <w:w w:val="80"/>
-                <w:sz w:val="24"/>
-              </w:rPr>
-              <w:t>The Patent Office, at Chennai</w:t>
-            </w:r>
+                <w:sz w:val="20"/>
+                <w:szCs w:val="20"/>
+              </w:rPr>
+              <w:t xml:space="preserve">The Patent Office, </w:t>
+            </w:r>
+            <w:r>
+              <w:rPr>
+                <w:rFonts w:hint="default" w:ascii="Arial"/>
+                <w:b/>
+                <w:w w:val="80"/>
+                <w:sz w:val="20"/>
+                <w:szCs w:val="20"/>
+                <w:lang w:val="en-US"/>
+              </w:rPr>
+              <w:t>Chennai</w:t>
+            </w:r>
+            <w:bookmarkStart w:id="0" w:name="_GoBack"/>
+            <w:bookmarkEnd w:id="0"/>
           </w:p>
         </w:tc>
       </w:tr>
@@ -3124,9 +3140,9 @@
     <w:lsdException w:unhideWhenUsed="0" w:uiPriority="68" w:semiHidden="0" w:name="Medium Grid 2"/>
     <w:lsdException w:unhideWhenUsed="0" w:uiPriority="69" w:semiHidden="0" w:name="Medium Grid 3"/>
     <w:lsdException w:unhideWhenUsed="0" w:uiPriority="70" w:semiHidden="0" w:name="Dark List"/>
-    <w:lsdException w:qFormat="1" w:unhideWhenUsed="0" w:uiPriority="71" w:semiHidden="0" w:name="Colorful Shading"/>
-    <w:lsdException w:qFormat="1" w:unhideWhenUsed="0" w:uiPriority="72" w:semiHidden="0" w:name="Colorful List"/>
-    <w:lsdException w:qFormat="1" w:unhideWhenUsed="0" w:uiPriority="73" w:semiHidden="0" w:name="Colorful Grid"/>
+    <w:lsdException w:unhideWhenUsed="0" w:uiPriority="71" w:semiHidden="0" w:name="Colorful Shading"/>
+    <w:lsdException w:unhideWhenUsed="0" w:uiPriority="72" w:semiHidden="0" w:name="Colorful List"/>
+    <w:lsdException w:unhideWhenUsed="0" w:uiPriority="73" w:semiHidden="0" w:name="Colorful Grid"/>
     <w:lsdException w:unhideWhenUsed="0" w:uiPriority="60" w:semiHidden="0" w:name="Light Shading Accent 1"/>
     <w:lsdException w:unhideWhenUsed="0" w:uiPriority="61" w:semiHidden="0" w:name="Light List Accent 1"/>
     <w:lsdException w:unhideWhenUsed="0" w:uiPriority="62" w:semiHidden="0" w:name="Light Grid Accent 1"/>
@@ -3139,9 +3155,9 @@
     <w:lsdException w:unhideWhenUsed="0" w:uiPriority="68" w:semiHidden="0" w:name="Medium Grid 2 Accent 1"/>
     <w:lsdException w:unhideWhenUsed="0" w:uiPriority="69" w:semiHidden="0" w:name="Medium Grid 3 Accent 1"/>
     <w:lsdException w:unhideWhenUsed="0" w:uiPriority="70" w:semiHidden="0" w:name="Dark List Accent 1"/>
-    <w:lsdException w:qFormat="1" w:unhideWhenUsed="0" w:uiPriority="71" w:semiHidden="0" w:name="Colorful Shading Accent 1"/>
-    <w:lsdException w:qFormat="1" w:unhideWhenUsed="0" w:uiPriority="72" w:semiHidden="0" w:name="Colorful List Accent 1"/>
-    <w:lsdException w:qFormat="1" w:unhideWhenUsed="0" w:uiPriority="73" w:semiHidden="0" w:name="Colorful Grid Accent 1"/>
+    <w:lsdException w:unhideWhenUsed="0" w:uiPriority="71" w:semiHidden="0" w:name="Colorful Shading Accent 1"/>
+    <w:lsdException w:unhideWhenUsed="0" w:uiPriority="72" w:semiHidden="0" w:name="Colorful List Accent 1"/>
+    <w:lsdException w:unhideWhenUsed="0" w:uiPriority="73" w:semiHidden="0" w:name="Colorful Grid Accent 1"/>
     <w:lsdException w:unhideWhenUsed="0" w:uiPriority="60" w:semiHidden="0" w:name="Light Shading Accent 2"/>
     <w:lsdException w:unhideWhenUsed="0" w:uiPriority="61" w:semiHidden="0" w:name="Light List Accent 2"/>
     <w:lsdException w:unhideWhenUsed="0" w:uiPriority="62" w:semiHidden="0" w:name="Light Grid Accent 2"/>
@@ -3153,9 +3169,9 @@
     <w:lsdException w:unhideWhenUsed="0" w:uiPriority="68" w:semiHidden="0" w:name="Medium Grid 2 Accent 2"/>
     <w:lsdException w:unhideWhenUsed="0" w:uiPriority="69" w:semiHidden="0" w:name="Medium Grid 3 Accent 2"/>
     <w:lsdException w:unhideWhenUsed="0" w:uiPriority="70" w:semiHidden="0" w:name="Dark List Accent 2"/>
-    <w:lsdException w:qFormat="1" w:unhideWhenUsed="0" w:uiPriority="71" w:semiHidden="0" w:name="Colorful Shading Accent 2"/>
-    <w:lsdException w:qFormat="1" w:unhideWhenUsed="0" w:uiPriority="72" w:semiHidden="0" w:name="Colorful List Accent 2"/>
-    <w:lsdException w:qFormat="1" w:unhideWhenUsed="0" w:uiPriority="73" w:semiHidden="0" w:name="Colorful Grid Accent 2"/>
+    <w:lsdException w:unhideWhenUsed="0" w:uiPriority="71" w:semiHidden="0" w:name="Colorful Shading Accent 2"/>
+    <w:lsdException w:unhideWhenUsed="0" w:uiPriority="72" w:semiHidden="0" w:name="Colorful List Accent 2"/>
+    <w:lsdException w:unhideWhenUsed="0" w:uiPriority="73" w:semiHidden="0" w:name="Colorful Grid Accent 2"/>
     <w:lsdException w:unhideWhenUsed="0" w:uiPriority="60" w:semiHidden="0" w:name="Light Shading Accent 3"/>
     <w:lsdException w:unhideWhenUsed="0" w:uiPriority="61" w:semiHidden="0" w:name="Light List Accent 3"/>
     <w:lsdException w:unhideWhenUsed="0" w:uiPriority="62" w:semiHidden="0" w:name="Light Grid Accent 3"/>
@@ -3167,9 +3183,9 @@
     <w:lsdException w:unhideWhenUsed="0" w:uiPriority="68" w:semiHidden="0" w:name="Medium Grid 2 Accent 3"/>
     <w:lsdException w:unhideWhenUsed="0" w:uiPriority="69" w:semiHidden="0" w:name="Medium Grid 3 Accent 3"/>
     <w:lsdException w:unhideWhenUsed="0" w:uiPriority="70" w:semiHidden="0" w:name="Dark List Accent 3"/>
-    <w:lsdException w:qFormat="1" w:unhideWhenUsed="0" w:uiPriority="71" w:semiHidden="0" w:name="Colorful Shading Accent 3"/>
-    <w:lsdException w:qFormat="1" w:unhideWhenUsed="0" w:uiPriority="72" w:semiHidden="0" w:name="Colorful List Accent 3"/>
-    <w:lsdException w:qFormat="1" w:unhideWhenUsed="0" w:uiPriority="73" w:semiHidden="0" w:name="Colorful Grid Accent 3"/>
+    <w:lsdException w:unhideWhenUsed="0" w:uiPriority="71" w:semiHidden="0" w:name="Colorful Shading Accent 3"/>
+    <w:lsdException w:unhideWhenUsed="0" w:uiPriority="72" w:semiHidden="0" w:name="Colorful List Accent 3"/>
+    <w:lsdException w:unhideWhenUsed="0" w:uiPriority="73" w:semiHidden="0" w:name="Colorful Grid Accent 3"/>
     <w:lsdException w:unhideWhenUsed="0" w:uiPriority="60" w:semiHidden="0" w:name="Light Shading Accent 4"/>
     <w:lsdException w:unhideWhenUsed="0" w:uiPriority="61" w:semiHidden="0" w:name="Light List Accent 4"/>
     <w:lsdException w:unhideWhenUsed="0" w:uiPriority="62" w:semiHidden="0" w:name="Light Grid Accent 4"/>
@@ -3181,9 +3197,9 @@
     <w:lsdException w:unhideWhenUsed="0" w:uiPriority="68" w:semiHidden="0" w:name="Medium Grid 2 Accent 4"/>
     <w:lsdException w:unhideWhenUsed="0" w:uiPriority="69" w:semiHidden="0" w:name="Medium Grid 3 Accent 4"/>
     <w:lsdException w:unhideWhenUsed="0" w:uiPriority="70" w:semiHidden="0" w:name="Dark List Accent 4"/>
-    <w:lsdException w:qFormat="1" w:unhideWhenUsed="0" w:uiPriority="71" w:semiHidden="0" w:name="Colorful Shading Accent 4"/>
-    <w:lsdException w:qFormat="1" w:unhideWhenUsed="0" w:uiPriority="72" w:semiHidden="0" w:name="Colorful List Accent 4"/>
-    <w:lsdException w:qFormat="1" w:unhideWhenUsed="0" w:uiPriority="73" w:semiHidden="0" w:name="Colorful Grid Accent 4"/>
+    <w:lsdException w:unhideWhenUsed="0" w:uiPriority="71" w:semiHidden="0" w:name="Colorful Shading Accent 4"/>
+    <w:lsdException w:unhideWhenUsed="0" w:uiPriority="72" w:semiHidden="0" w:name="Colorful List Accent 4"/>
+    <w:lsdException w:unhideWhenUsed="0" w:uiPriority="73" w:semiHidden="0" w:name="Colorful Grid Accent 4"/>
     <w:lsdException w:unhideWhenUsed="0" w:uiPriority="60" w:semiHidden="0" w:name="Light Shading Accent 5"/>
     <w:lsdException w:unhideWhenUsed="0" w:uiPriority="61" w:semiHidden="0" w:name="Light List Accent 5"/>
     <w:lsdException w:unhideWhenUsed="0" w:uiPriority="62" w:semiHidden="0" w:name="Light Grid Accent 5"/>
@@ -3195,9 +3211,9 @@
     <w:lsdException w:unhideWhenUsed="0" w:uiPriority="68" w:semiHidden="0" w:name="Medium Grid 2 Accent 5"/>
     <w:lsdException w:unhideWhenUsed="0" w:uiPriority="69" w:semiHidden="0" w:name="Medium Grid 3 Accent 5"/>
     <w:lsdException w:unhideWhenUsed="0" w:uiPriority="70" w:semiHidden="0" w:name="Dark List Accent 5"/>
-    <w:lsdException w:qFormat="1" w:unhideWhenUsed="0" w:uiPriority="71" w:semiHidden="0" w:name="Colorful Shading Accent 5"/>
-    <w:lsdException w:qFormat="1" w:unhideWhenUsed="0" w:uiPriority="72" w:semiHidden="0" w:name="Colorful List Accent 5"/>
-    <w:lsdException w:qFormat="1" w:unhideWhenUsed="0" w:uiPriority="73" w:semiHidden="0" w:name="Colorful Grid Accent 5"/>
+    <w:lsdException w:unhideWhenUsed="0" w:uiPriority="71" w:semiHidden="0" w:name="Colorful Shading Accent 5"/>
+    <w:lsdException w:unhideWhenUsed="0" w:uiPriority="72" w:semiHidden="0" w:name="Colorful List Accent 5"/>
+    <w:lsdException w:unhideWhenUsed="0" w:uiPriority="73" w:semiHidden="0" w:name="Colorful Grid Accent 5"/>
     <w:lsdException w:unhideWhenUsed="0" w:uiPriority="60" w:semiHidden="0" w:name="Light Shading Accent 6"/>
     <w:lsdException w:unhideWhenUsed="0" w:uiPriority="61" w:semiHidden="0" w:name="Light List Accent 6"/>
     <w:lsdException w:unhideWhenUsed="0" w:uiPriority="62" w:semiHidden="0" w:name="Light Grid Accent 6"/>
@@ -3209,9 +3225,9 @@
     <w:lsdException w:unhideWhenUsed="0" w:uiPriority="68" w:semiHidden="0" w:name="Medium Grid 2 Accent 6"/>
     <w:lsdException w:unhideWhenUsed="0" w:uiPriority="69" w:semiHidden="0" w:name="Medium Grid 3 Accent 6"/>
     <w:lsdException w:unhideWhenUsed="0" w:uiPriority="70" w:semiHidden="0" w:name="Dark List Accent 6"/>
-    <w:lsdException w:qFormat="1" w:unhideWhenUsed="0" w:uiPriority="71" w:semiHidden="0" w:name="Colorful Shading Accent 6"/>
-    <w:lsdException w:qFormat="1" w:unhideWhenUsed="0" w:uiPriority="72" w:semiHidden="0" w:name="Colorful List Accent 6"/>
-    <w:lsdException w:qFormat="1" w:unhideWhenUsed="0" w:uiPriority="73" w:semiHidden="0" w:name="Colorful Grid Accent 6"/>
+    <w:lsdException w:unhideWhenUsed="0" w:uiPriority="71" w:semiHidden="0" w:name="Colorful Shading Accent 6"/>
+    <w:lsdException w:unhideWhenUsed="0" w:uiPriority="72" w:semiHidden="0" w:name="Colorful List Accent 6"/>
+    <w:lsdException w:unhideWhenUsed="0" w:uiPriority="73" w:semiHidden="0" w:name="Colorful Grid Accent 6"/>
   </w:latentStyles>
   <w:style w:type="paragraph" w:default="1" w:styleId="1">
     <w:name w:val="Normal"/>

</xml_diff>